<commit_message>
session 12 file upload
</commit_message>
<xml_diff>
--- a/Session_7_bansi.docx
+++ b/Session_7_bansi.docx
@@ -186,23 +186,7 @@
           <w:sz w:val="28"/>
           <w:szCs w:val="28"/>
         </w:rPr>
-        <w:t xml:space="preserve">            </w:t>
-      </w:r>
-      <w:proofErr w:type="spellStart"/>
-      <w:r>
-        <w:rPr>
-          <w:sz w:val="28"/>
-          <w:szCs w:val="28"/>
-        </w:rPr>
-        <w:t>cout</w:t>
-      </w:r>
-      <w:proofErr w:type="spellEnd"/>
-      <w:r>
-        <w:rPr>
-          <w:sz w:val="28"/>
-          <w:szCs w:val="28"/>
-        </w:rPr>
-        <w:t xml:space="preserve"> &lt;&lt; "</w:t>
+        <w:t xml:space="preserve">            cout &lt;&lt; "</w:t>
       </w:r>
       <w:r>
         <w:rPr>
@@ -247,39 +231,7 @@
           <w:sz w:val="28"/>
           <w:szCs w:val="28"/>
         </w:rPr>
-        <w:t xml:space="preserve">        </w:t>
-      </w:r>
-      <w:proofErr w:type="spellStart"/>
-      <w:r>
-        <w:rPr>
-          <w:sz w:val="28"/>
-          <w:szCs w:val="28"/>
-        </w:rPr>
-        <w:t>cout</w:t>
-      </w:r>
-      <w:proofErr w:type="spellEnd"/>
-      <w:r>
-        <w:rPr>
-          <w:sz w:val="28"/>
-          <w:szCs w:val="28"/>
-        </w:rPr>
-        <w:t xml:space="preserve"> &lt;&lt; </w:t>
-      </w:r>
-      <w:proofErr w:type="spellStart"/>
-      <w:r>
-        <w:rPr>
-          <w:sz w:val="28"/>
-          <w:szCs w:val="28"/>
-        </w:rPr>
-        <w:t>endl</w:t>
-      </w:r>
-      <w:proofErr w:type="spellEnd"/>
-      <w:r>
-        <w:rPr>
-          <w:sz w:val="28"/>
-          <w:szCs w:val="28"/>
-        </w:rPr>
-        <w:t>;</w:t>
+        <w:t xml:space="preserve">        cout &lt;&lt; endl;</w:t>
       </w:r>
     </w:p>
     <w:p>
@@ -772,23 +724,7 @@
           <w:sz w:val="28"/>
           <w:szCs w:val="28"/>
         </w:rPr>
-        <w:t>#include &lt;</w:t>
-      </w:r>
-      <w:proofErr w:type="spellStart"/>
-      <w:r>
-        <w:rPr>
-          <w:sz w:val="28"/>
-          <w:szCs w:val="28"/>
-        </w:rPr>
-        <w:t>stdio.h</w:t>
-      </w:r>
-      <w:proofErr w:type="spellEnd"/>
-      <w:r>
-        <w:rPr>
-          <w:sz w:val="28"/>
-          <w:szCs w:val="28"/>
-        </w:rPr>
-        <w:t>&gt;</w:t>
+        <w:t>#include &lt;stdio.h&gt;</w:t>
       </w:r>
     </w:p>
     <w:p>
@@ -841,94 +777,30 @@
           <w:sz w:val="28"/>
           <w:szCs w:val="28"/>
         </w:rPr>
-        <w:t xml:space="preserve">    int </w:t>
-      </w:r>
-      <w:proofErr w:type="spellStart"/>
-      <w:r>
-        <w:rPr>
-          <w:sz w:val="28"/>
-          <w:szCs w:val="28"/>
-        </w:rPr>
-        <w:t>i</w:t>
-      </w:r>
-      <w:proofErr w:type="spellEnd"/>
-      <w:r>
-        <w:rPr>
-          <w:sz w:val="28"/>
-          <w:szCs w:val="28"/>
-        </w:rPr>
-        <w:t>, j;</w:t>
-      </w:r>
-    </w:p>
-    <w:p>
-      <w:pPr>
-        <w:rPr>
-          <w:sz w:val="28"/>
-          <w:szCs w:val="28"/>
-        </w:rPr>
-      </w:pPr>
-    </w:p>
-    <w:p>
-      <w:pPr>
-        <w:rPr>
-          <w:sz w:val="28"/>
-          <w:szCs w:val="28"/>
-        </w:rPr>
-      </w:pPr>
-      <w:r>
-        <w:rPr>
-          <w:sz w:val="28"/>
-          <w:szCs w:val="28"/>
-        </w:rPr>
-        <w:t xml:space="preserve">    for(</w:t>
-      </w:r>
-      <w:proofErr w:type="spellStart"/>
-      <w:r>
-        <w:rPr>
-          <w:sz w:val="28"/>
-          <w:szCs w:val="28"/>
-        </w:rPr>
-        <w:t>i</w:t>
-      </w:r>
-      <w:proofErr w:type="spellEnd"/>
-      <w:r>
-        <w:rPr>
-          <w:sz w:val="28"/>
-          <w:szCs w:val="28"/>
-        </w:rPr>
-        <w:t xml:space="preserve"> = 1; </w:t>
-      </w:r>
-      <w:proofErr w:type="spellStart"/>
-      <w:r>
-        <w:rPr>
-          <w:sz w:val="28"/>
-          <w:szCs w:val="28"/>
-        </w:rPr>
-        <w:t>i</w:t>
-      </w:r>
-      <w:proofErr w:type="spellEnd"/>
-      <w:r>
-        <w:rPr>
-          <w:sz w:val="28"/>
-          <w:szCs w:val="28"/>
-        </w:rPr>
-        <w:t xml:space="preserve"> &lt;= 5; </w:t>
-      </w:r>
-      <w:proofErr w:type="spellStart"/>
-      <w:r>
-        <w:rPr>
-          <w:sz w:val="28"/>
-          <w:szCs w:val="28"/>
-        </w:rPr>
-        <w:t>i</w:t>
-      </w:r>
-      <w:proofErr w:type="spellEnd"/>
-      <w:r>
-        <w:rPr>
-          <w:sz w:val="28"/>
-          <w:szCs w:val="28"/>
-        </w:rPr>
-        <w:t>++)</w:t>
+        <w:t xml:space="preserve">    int i, j;</w:t>
+      </w:r>
+    </w:p>
+    <w:p>
+      <w:pPr>
+        <w:rPr>
+          <w:sz w:val="28"/>
+          <w:szCs w:val="28"/>
+        </w:rPr>
+      </w:pPr>
+    </w:p>
+    <w:p>
+      <w:pPr>
+        <w:rPr>
+          <w:sz w:val="28"/>
+          <w:szCs w:val="28"/>
+        </w:rPr>
+      </w:pPr>
+      <w:r>
+        <w:rPr>
+          <w:sz w:val="28"/>
+          <w:szCs w:val="28"/>
+        </w:rPr>
+        <w:t xml:space="preserve">    for(i = 1; i &lt;= 5; i++)</w:t>
       </w:r>
     </w:p>
     <w:p>
@@ -958,39 +830,7 @@
           <w:sz w:val="28"/>
           <w:szCs w:val="28"/>
         </w:rPr>
-        <w:t xml:space="preserve">        for(j = 1; j &lt;= </w:t>
-      </w:r>
-      <w:proofErr w:type="spellStart"/>
-      <w:r>
-        <w:rPr>
-          <w:sz w:val="28"/>
-          <w:szCs w:val="28"/>
-        </w:rPr>
-        <w:t>i</w:t>
-      </w:r>
-      <w:proofErr w:type="spellEnd"/>
-      <w:r>
-        <w:rPr>
-          <w:sz w:val="28"/>
-          <w:szCs w:val="28"/>
-        </w:rPr>
-        <w:t xml:space="preserve">; </w:t>
-      </w:r>
-      <w:proofErr w:type="spellStart"/>
-      <w:r>
-        <w:rPr>
-          <w:sz w:val="28"/>
-          <w:szCs w:val="28"/>
-        </w:rPr>
-        <w:t>j++</w:t>
-      </w:r>
-      <w:proofErr w:type="spellEnd"/>
-      <w:r>
-        <w:rPr>
-          <w:sz w:val="28"/>
-          <w:szCs w:val="28"/>
-        </w:rPr>
-        <w:t>)</w:t>
+        <w:t xml:space="preserve">        for(j = 1; j &lt;= i; j++)</w:t>
       </w:r>
     </w:p>
     <w:p>
@@ -1020,23 +860,7 @@
           <w:sz w:val="28"/>
           <w:szCs w:val="28"/>
         </w:rPr>
-        <w:t xml:space="preserve">            </w:t>
-      </w:r>
-      <w:proofErr w:type="spellStart"/>
-      <w:r>
-        <w:rPr>
-          <w:sz w:val="28"/>
-          <w:szCs w:val="28"/>
-        </w:rPr>
-        <w:t>printf</w:t>
-      </w:r>
-      <w:proofErr w:type="spellEnd"/>
-      <w:r>
-        <w:rPr>
-          <w:sz w:val="28"/>
-          <w:szCs w:val="28"/>
-        </w:rPr>
-        <w:t>("%d ", j);</w:t>
+        <w:t xml:space="preserve">            printf("%d ", j);</w:t>
       </w:r>
     </w:p>
     <w:p>
@@ -1066,23 +890,7 @@
           <w:sz w:val="28"/>
           <w:szCs w:val="28"/>
         </w:rPr>
-        <w:t xml:space="preserve">        </w:t>
-      </w:r>
-      <w:proofErr w:type="spellStart"/>
-      <w:r>
-        <w:rPr>
-          <w:sz w:val="28"/>
-          <w:szCs w:val="28"/>
-        </w:rPr>
-        <w:t>printf</w:t>
-      </w:r>
-      <w:proofErr w:type="spellEnd"/>
-      <w:r>
-        <w:rPr>
-          <w:sz w:val="28"/>
-          <w:szCs w:val="28"/>
-        </w:rPr>
-        <w:t>("\n");</w:t>
+        <w:t xml:space="preserve">        printf("\n");</w:t>
       </w:r>
     </w:p>
     <w:p>
@@ -1254,9 +1062,357 @@
           <w:szCs w:val="28"/>
         </w:rPr>
         <w:lastRenderedPageBreak/>
-        <w:t xml:space="preserve">3.Create a pattern that prints a pyramid of stars (*) with 6 rows, </w:t>
-      </w:r>
-      <w:proofErr w:type="spellStart"/>
+        <w:t>3.Create a pattern that prints a pyramid of stars (*) with 6 rows, centered like the loading animation you see on BookMyShow when a page is loading.&lt;br&gt;&lt;br&gt;&lt;em&gt;&lt;strong&gt;Hint:&lt;/strong&gt; Use spaces to align the stars in the center for each row.&lt;/em&gt;</w:t>
+      </w:r>
+    </w:p>
+    <w:p>
+      <w:pPr>
+        <w:rPr>
+          <w:sz w:val="28"/>
+          <w:szCs w:val="28"/>
+        </w:rPr>
+      </w:pPr>
+      <w:r>
+        <w:rPr>
+          <w:sz w:val="28"/>
+          <w:szCs w:val="28"/>
+        </w:rPr>
+        <w:t>#include &lt;stdio.h&gt;</w:t>
+      </w:r>
+    </w:p>
+    <w:p>
+      <w:pPr>
+        <w:rPr>
+          <w:sz w:val="28"/>
+          <w:szCs w:val="28"/>
+        </w:rPr>
+      </w:pPr>
+    </w:p>
+    <w:p>
+      <w:pPr>
+        <w:rPr>
+          <w:sz w:val="28"/>
+          <w:szCs w:val="28"/>
+        </w:rPr>
+      </w:pPr>
+      <w:r>
+        <w:rPr>
+          <w:sz w:val="28"/>
+          <w:szCs w:val="28"/>
+        </w:rPr>
+        <w:t>int main()</w:t>
+      </w:r>
+    </w:p>
+    <w:p>
+      <w:pPr>
+        <w:rPr>
+          <w:sz w:val="28"/>
+          <w:szCs w:val="28"/>
+        </w:rPr>
+      </w:pPr>
+      <w:r>
+        <w:rPr>
+          <w:sz w:val="28"/>
+          <w:szCs w:val="28"/>
+        </w:rPr>
+        <w:t>{</w:t>
+      </w:r>
+    </w:p>
+    <w:p>
+      <w:pPr>
+        <w:rPr>
+          <w:sz w:val="28"/>
+          <w:szCs w:val="28"/>
+        </w:rPr>
+      </w:pPr>
+      <w:r>
+        <w:rPr>
+          <w:sz w:val="28"/>
+          <w:szCs w:val="28"/>
+        </w:rPr>
+        <w:t xml:space="preserve">    int i, j;</w:t>
+      </w:r>
+    </w:p>
+    <w:p>
+      <w:pPr>
+        <w:rPr>
+          <w:sz w:val="28"/>
+          <w:szCs w:val="28"/>
+        </w:rPr>
+      </w:pPr>
+    </w:p>
+    <w:p>
+      <w:pPr>
+        <w:rPr>
+          <w:sz w:val="28"/>
+          <w:szCs w:val="28"/>
+        </w:rPr>
+      </w:pPr>
+      <w:r>
+        <w:rPr>
+          <w:sz w:val="28"/>
+          <w:szCs w:val="28"/>
+        </w:rPr>
+        <w:t xml:space="preserve">    for(i = 1; i &lt;= 6; i++)</w:t>
+      </w:r>
+    </w:p>
+    <w:p>
+      <w:pPr>
+        <w:rPr>
+          <w:sz w:val="28"/>
+          <w:szCs w:val="28"/>
+        </w:rPr>
+      </w:pPr>
+      <w:r>
+        <w:rPr>
+          <w:sz w:val="28"/>
+          <w:szCs w:val="28"/>
+        </w:rPr>
+        <w:t xml:space="preserve">    {</w:t>
+      </w:r>
+    </w:p>
+    <w:p>
+      <w:pPr>
+        <w:rPr>
+          <w:sz w:val="28"/>
+          <w:szCs w:val="28"/>
+        </w:rPr>
+      </w:pPr>
+      <w:r>
+        <w:rPr>
+          <w:sz w:val="28"/>
+          <w:szCs w:val="28"/>
+        </w:rPr>
+        <w:t xml:space="preserve">        // Print spaces</w:t>
+      </w:r>
+    </w:p>
+    <w:p>
+      <w:pPr>
+        <w:rPr>
+          <w:sz w:val="28"/>
+          <w:szCs w:val="28"/>
+        </w:rPr>
+      </w:pPr>
+      <w:r>
+        <w:rPr>
+          <w:sz w:val="28"/>
+          <w:szCs w:val="28"/>
+        </w:rPr>
+        <w:t xml:space="preserve">        for(j = 1; j &lt;= 6 - i; j++)</w:t>
+      </w:r>
+    </w:p>
+    <w:p>
+      <w:pPr>
+        <w:rPr>
+          <w:sz w:val="28"/>
+          <w:szCs w:val="28"/>
+        </w:rPr>
+      </w:pPr>
+      <w:r>
+        <w:rPr>
+          <w:sz w:val="28"/>
+          <w:szCs w:val="28"/>
+        </w:rPr>
+        <w:t xml:space="preserve">        {</w:t>
+      </w:r>
+    </w:p>
+    <w:p>
+      <w:pPr>
+        <w:rPr>
+          <w:sz w:val="28"/>
+          <w:szCs w:val="28"/>
+        </w:rPr>
+      </w:pPr>
+      <w:r>
+        <w:rPr>
+          <w:sz w:val="28"/>
+          <w:szCs w:val="28"/>
+        </w:rPr>
+        <w:t xml:space="preserve">            printf(" ");</w:t>
+      </w:r>
+    </w:p>
+    <w:p>
+      <w:pPr>
+        <w:rPr>
+          <w:sz w:val="28"/>
+          <w:szCs w:val="28"/>
+        </w:rPr>
+      </w:pPr>
+      <w:r>
+        <w:rPr>
+          <w:sz w:val="28"/>
+          <w:szCs w:val="28"/>
+        </w:rPr>
+        <w:t xml:space="preserve">        }</w:t>
+      </w:r>
+    </w:p>
+    <w:p>
+      <w:pPr>
+        <w:rPr>
+          <w:sz w:val="28"/>
+          <w:szCs w:val="28"/>
+        </w:rPr>
+      </w:pPr>
+    </w:p>
+    <w:p>
+      <w:pPr>
+        <w:rPr>
+          <w:sz w:val="28"/>
+          <w:szCs w:val="28"/>
+        </w:rPr>
+      </w:pPr>
+      <w:r>
+        <w:rPr>
+          <w:sz w:val="28"/>
+          <w:szCs w:val="28"/>
+        </w:rPr>
+        <w:t xml:space="preserve">        // Print stars</w:t>
+      </w:r>
+    </w:p>
+    <w:p>
+      <w:pPr>
+        <w:rPr>
+          <w:sz w:val="28"/>
+          <w:szCs w:val="28"/>
+        </w:rPr>
+      </w:pPr>
+      <w:r>
+        <w:rPr>
+          <w:sz w:val="28"/>
+          <w:szCs w:val="28"/>
+        </w:rPr>
+        <w:t xml:space="preserve">        for(j = 1; j &lt;= 2 * i - 1; j++)</w:t>
+      </w:r>
+    </w:p>
+    <w:p>
+      <w:pPr>
+        <w:rPr>
+          <w:sz w:val="28"/>
+          <w:szCs w:val="28"/>
+        </w:rPr>
+      </w:pPr>
+      <w:r>
+        <w:rPr>
+          <w:sz w:val="28"/>
+          <w:szCs w:val="28"/>
+        </w:rPr>
+        <w:t xml:space="preserve">        {</w:t>
+      </w:r>
+    </w:p>
+    <w:p>
+      <w:pPr>
+        <w:rPr>
+          <w:sz w:val="28"/>
+          <w:szCs w:val="28"/>
+        </w:rPr>
+      </w:pPr>
+      <w:r>
+        <w:rPr>
+          <w:sz w:val="28"/>
+          <w:szCs w:val="28"/>
+        </w:rPr>
+        <w:t xml:space="preserve">            printf("*");</w:t>
+      </w:r>
+    </w:p>
+    <w:p>
+      <w:pPr>
+        <w:rPr>
+          <w:sz w:val="28"/>
+          <w:szCs w:val="28"/>
+        </w:rPr>
+      </w:pPr>
+      <w:r>
+        <w:rPr>
+          <w:sz w:val="28"/>
+          <w:szCs w:val="28"/>
+        </w:rPr>
+        <w:t xml:space="preserve">        }</w:t>
+      </w:r>
+    </w:p>
+    <w:p>
+      <w:pPr>
+        <w:rPr>
+          <w:sz w:val="28"/>
+          <w:szCs w:val="28"/>
+        </w:rPr>
+      </w:pPr>
+    </w:p>
+    <w:p>
+      <w:pPr>
+        <w:rPr>
+          <w:sz w:val="28"/>
+          <w:szCs w:val="28"/>
+        </w:rPr>
+      </w:pPr>
+      <w:r>
+        <w:rPr>
+          <w:sz w:val="28"/>
+          <w:szCs w:val="28"/>
+        </w:rPr>
+        <w:t xml:space="preserve">        printf("\n");</w:t>
+      </w:r>
+    </w:p>
+    <w:p>
+      <w:pPr>
+        <w:rPr>
+          <w:sz w:val="28"/>
+          <w:szCs w:val="28"/>
+        </w:rPr>
+      </w:pPr>
+      <w:r>
+        <w:rPr>
+          <w:sz w:val="28"/>
+          <w:szCs w:val="28"/>
+        </w:rPr>
+        <w:t xml:space="preserve">    }</w:t>
+      </w:r>
+    </w:p>
+    <w:p>
+      <w:pPr>
+        <w:rPr>
+          <w:sz w:val="28"/>
+          <w:szCs w:val="28"/>
+        </w:rPr>
+      </w:pPr>
+    </w:p>
+    <w:p>
+      <w:pPr>
+        <w:rPr>
+          <w:sz w:val="28"/>
+          <w:szCs w:val="28"/>
+        </w:rPr>
+      </w:pPr>
+      <w:r>
+        <w:rPr>
+          <w:sz w:val="28"/>
+          <w:szCs w:val="28"/>
+        </w:rPr>
+        <w:lastRenderedPageBreak/>
+        <w:t xml:space="preserve">    return 0;</w:t>
+      </w:r>
+    </w:p>
+    <w:p>
+      <w:pPr>
+        <w:rPr>
+          <w:sz w:val="28"/>
+          <w:szCs w:val="28"/>
+        </w:rPr>
+      </w:pPr>
+      <w:r>
+        <w:rPr>
+          <w:sz w:val="28"/>
+          <w:szCs w:val="28"/>
+        </w:rPr>
+        <w:t>}</w:t>
+      </w:r>
+    </w:p>
+    <w:p>
+      <w:pPr>
+        <w:rPr>
+          <w:sz w:val="28"/>
+          <w:szCs w:val="28"/>
+        </w:rPr>
+      </w:pPr>
       <w:r>
         <w:rPr>
           <w:b/>
@@ -1264,19 +1420,116 @@
           <w:sz w:val="28"/>
           <w:szCs w:val="28"/>
         </w:rPr>
-        <w:t>centered</w:t>
-      </w:r>
-      <w:proofErr w:type="spellEnd"/>
-      <w:r>
+        <w:t>Output:</w:t>
+      </w:r>
+    </w:p>
+    <w:p>
+      <w:pPr>
+        <w:rPr>
+          <w:sz w:val="28"/>
+          <w:szCs w:val="28"/>
+        </w:rPr>
+      </w:pPr>
+      <w:r>
+        <w:rPr>
+          <w:sz w:val="28"/>
+          <w:szCs w:val="28"/>
+        </w:rPr>
+        <w:t xml:space="preserve">     *</w:t>
+      </w:r>
+    </w:p>
+    <w:p>
+      <w:pPr>
+        <w:rPr>
+          <w:sz w:val="28"/>
+          <w:szCs w:val="28"/>
+        </w:rPr>
+      </w:pPr>
+      <w:r>
+        <w:rPr>
+          <w:sz w:val="28"/>
+          <w:szCs w:val="28"/>
+        </w:rPr>
+        <w:t xml:space="preserve">    ***</w:t>
+      </w:r>
+    </w:p>
+    <w:p>
+      <w:pPr>
+        <w:rPr>
+          <w:sz w:val="28"/>
+          <w:szCs w:val="28"/>
+        </w:rPr>
+      </w:pPr>
+      <w:r>
+        <w:rPr>
+          <w:sz w:val="28"/>
+          <w:szCs w:val="28"/>
+        </w:rPr>
+        <w:t xml:space="preserve">   *****</w:t>
+      </w:r>
+    </w:p>
+    <w:p>
+      <w:pPr>
+        <w:rPr>
+          <w:sz w:val="28"/>
+          <w:szCs w:val="28"/>
+        </w:rPr>
+      </w:pPr>
+      <w:r>
+        <w:rPr>
+          <w:sz w:val="28"/>
+          <w:szCs w:val="28"/>
+        </w:rPr>
+        <w:t xml:space="preserve">  *******</w:t>
+      </w:r>
+    </w:p>
+    <w:p>
+      <w:pPr>
+        <w:rPr>
+          <w:sz w:val="28"/>
+          <w:szCs w:val="28"/>
+        </w:rPr>
+      </w:pPr>
+      <w:r>
+        <w:rPr>
+          <w:sz w:val="28"/>
+          <w:szCs w:val="28"/>
+        </w:rPr>
+        <w:t xml:space="preserve"> *********</w:t>
+      </w:r>
+    </w:p>
+    <w:p>
+      <w:pPr>
+        <w:rPr>
+          <w:sz w:val="28"/>
+          <w:szCs w:val="28"/>
+        </w:rPr>
+      </w:pPr>
+      <w:r>
+        <w:rPr>
+          <w:sz w:val="28"/>
+          <w:szCs w:val="28"/>
+        </w:rPr>
+        <w:t>***********</w:t>
+      </w:r>
+    </w:p>
+    <w:p>
+      <w:pPr>
+        <w:rPr>
+          <w:sz w:val="28"/>
+          <w:szCs w:val="28"/>
+        </w:rPr>
+      </w:pPr>
+    </w:p>
+    <w:p>
+      <w:pPr>
         <w:rPr>
           <w:b/>
           <w:bCs/>
           <w:sz w:val="28"/>
           <w:szCs w:val="28"/>
         </w:rPr>
-        <w:t xml:space="preserve"> like the loading animation you see on </w:t>
-      </w:r>
-      <w:proofErr w:type="spellStart"/>
+      </w:pPr>
       <w:r>
         <w:rPr>
           <w:b/>
@@ -1284,9 +1537,304 @@
           <w:sz w:val="28"/>
           <w:szCs w:val="28"/>
         </w:rPr>
-        <w:t>BookMyShow</w:t>
-      </w:r>
-      <w:proofErr w:type="spellEnd"/>
+        <w:t>4.Write code using nested loops to print a pattern of alternating 0s and 1s in a grid, like the checkered background seen in some Spotify playlist covers (e.g., for a 4x4 grid, alternate 0 and 1 in each cell).</w:t>
+      </w:r>
+    </w:p>
+    <w:p>
+      <w:pPr>
+        <w:rPr>
+          <w:sz w:val="28"/>
+          <w:szCs w:val="28"/>
+        </w:rPr>
+      </w:pPr>
+      <w:r>
+        <w:rPr>
+          <w:sz w:val="28"/>
+          <w:szCs w:val="28"/>
+        </w:rPr>
+        <w:t>#include &lt;stdio.h&gt;</w:t>
+      </w:r>
+    </w:p>
+    <w:p>
+      <w:pPr>
+        <w:rPr>
+          <w:sz w:val="28"/>
+          <w:szCs w:val="28"/>
+        </w:rPr>
+      </w:pPr>
+    </w:p>
+    <w:p>
+      <w:pPr>
+        <w:rPr>
+          <w:sz w:val="28"/>
+          <w:szCs w:val="28"/>
+        </w:rPr>
+      </w:pPr>
+      <w:r>
+        <w:rPr>
+          <w:sz w:val="28"/>
+          <w:szCs w:val="28"/>
+        </w:rPr>
+        <w:t>int main()</w:t>
+      </w:r>
+    </w:p>
+    <w:p>
+      <w:pPr>
+        <w:rPr>
+          <w:sz w:val="28"/>
+          <w:szCs w:val="28"/>
+        </w:rPr>
+      </w:pPr>
+      <w:r>
+        <w:rPr>
+          <w:sz w:val="28"/>
+          <w:szCs w:val="28"/>
+        </w:rPr>
+        <w:t>{</w:t>
+      </w:r>
+    </w:p>
+    <w:p>
+      <w:pPr>
+        <w:rPr>
+          <w:sz w:val="28"/>
+          <w:szCs w:val="28"/>
+        </w:rPr>
+      </w:pPr>
+      <w:r>
+        <w:rPr>
+          <w:sz w:val="28"/>
+          <w:szCs w:val="28"/>
+        </w:rPr>
+        <w:t xml:space="preserve">    int i, j;</w:t>
+      </w:r>
+    </w:p>
+    <w:p>
+      <w:pPr>
+        <w:rPr>
+          <w:sz w:val="28"/>
+          <w:szCs w:val="28"/>
+        </w:rPr>
+      </w:pPr>
+    </w:p>
+    <w:p>
+      <w:pPr>
+        <w:rPr>
+          <w:sz w:val="28"/>
+          <w:szCs w:val="28"/>
+        </w:rPr>
+      </w:pPr>
+      <w:r>
+        <w:rPr>
+          <w:sz w:val="28"/>
+          <w:szCs w:val="28"/>
+        </w:rPr>
+        <w:t xml:space="preserve">    for(i = 1; i &lt;= 4; i++)</w:t>
+      </w:r>
+    </w:p>
+    <w:p>
+      <w:pPr>
+        <w:rPr>
+          <w:sz w:val="28"/>
+          <w:szCs w:val="28"/>
+        </w:rPr>
+      </w:pPr>
+      <w:r>
+        <w:rPr>
+          <w:sz w:val="28"/>
+          <w:szCs w:val="28"/>
+        </w:rPr>
+        <w:t xml:space="preserve">    {</w:t>
+      </w:r>
+    </w:p>
+    <w:p>
+      <w:pPr>
+        <w:rPr>
+          <w:sz w:val="28"/>
+          <w:szCs w:val="28"/>
+        </w:rPr>
+      </w:pPr>
+      <w:r>
+        <w:rPr>
+          <w:sz w:val="28"/>
+          <w:szCs w:val="28"/>
+        </w:rPr>
+        <w:t xml:space="preserve">        for(j = 1; j &lt;= 4; j++)</w:t>
+      </w:r>
+    </w:p>
+    <w:p>
+      <w:pPr>
+        <w:rPr>
+          <w:sz w:val="28"/>
+          <w:szCs w:val="28"/>
+        </w:rPr>
+      </w:pPr>
+      <w:r>
+        <w:rPr>
+          <w:sz w:val="28"/>
+          <w:szCs w:val="28"/>
+        </w:rPr>
+        <w:t xml:space="preserve">        {</w:t>
+      </w:r>
+    </w:p>
+    <w:p>
+      <w:pPr>
+        <w:rPr>
+          <w:sz w:val="28"/>
+          <w:szCs w:val="28"/>
+        </w:rPr>
+      </w:pPr>
+      <w:r>
+        <w:rPr>
+          <w:sz w:val="28"/>
+          <w:szCs w:val="28"/>
+        </w:rPr>
+        <w:t xml:space="preserve">            if((i + j) % 2 == 0)</w:t>
+      </w:r>
+    </w:p>
+    <w:p>
+      <w:pPr>
+        <w:rPr>
+          <w:sz w:val="28"/>
+          <w:szCs w:val="28"/>
+        </w:rPr>
+      </w:pPr>
+      <w:r>
+        <w:rPr>
+          <w:sz w:val="28"/>
+          <w:szCs w:val="28"/>
+        </w:rPr>
+        <w:t xml:space="preserve">                printf("0 ");</w:t>
+      </w:r>
+    </w:p>
+    <w:p>
+      <w:pPr>
+        <w:rPr>
+          <w:sz w:val="28"/>
+          <w:szCs w:val="28"/>
+        </w:rPr>
+      </w:pPr>
+      <w:r>
+        <w:rPr>
+          <w:sz w:val="28"/>
+          <w:szCs w:val="28"/>
+        </w:rPr>
+        <w:t xml:space="preserve">            else</w:t>
+      </w:r>
+    </w:p>
+    <w:p>
+      <w:pPr>
+        <w:rPr>
+          <w:sz w:val="28"/>
+          <w:szCs w:val="28"/>
+        </w:rPr>
+      </w:pPr>
+      <w:r>
+        <w:rPr>
+          <w:sz w:val="28"/>
+          <w:szCs w:val="28"/>
+        </w:rPr>
+        <w:t xml:space="preserve">                printf("1 ");</w:t>
+      </w:r>
+    </w:p>
+    <w:p>
+      <w:pPr>
+        <w:rPr>
+          <w:sz w:val="28"/>
+          <w:szCs w:val="28"/>
+        </w:rPr>
+      </w:pPr>
+      <w:r>
+        <w:rPr>
+          <w:sz w:val="28"/>
+          <w:szCs w:val="28"/>
+        </w:rPr>
+        <w:lastRenderedPageBreak/>
+        <w:t xml:space="preserve">        }</w:t>
+      </w:r>
+    </w:p>
+    <w:p>
+      <w:pPr>
+        <w:rPr>
+          <w:sz w:val="28"/>
+          <w:szCs w:val="28"/>
+        </w:rPr>
+      </w:pPr>
+    </w:p>
+    <w:p>
+      <w:pPr>
+        <w:rPr>
+          <w:sz w:val="28"/>
+          <w:szCs w:val="28"/>
+        </w:rPr>
+      </w:pPr>
+      <w:r>
+        <w:rPr>
+          <w:sz w:val="28"/>
+          <w:szCs w:val="28"/>
+        </w:rPr>
+        <w:t xml:space="preserve">        printf("\n");</w:t>
+      </w:r>
+    </w:p>
+    <w:p>
+      <w:pPr>
+        <w:rPr>
+          <w:sz w:val="28"/>
+          <w:szCs w:val="28"/>
+        </w:rPr>
+      </w:pPr>
+      <w:r>
+        <w:rPr>
+          <w:sz w:val="28"/>
+          <w:szCs w:val="28"/>
+        </w:rPr>
+        <w:t xml:space="preserve">    }</w:t>
+      </w:r>
+    </w:p>
+    <w:p>
+      <w:pPr>
+        <w:rPr>
+          <w:sz w:val="28"/>
+          <w:szCs w:val="28"/>
+        </w:rPr>
+      </w:pPr>
+    </w:p>
+    <w:p>
+      <w:pPr>
+        <w:rPr>
+          <w:sz w:val="28"/>
+          <w:szCs w:val="28"/>
+        </w:rPr>
+      </w:pPr>
+      <w:r>
+        <w:rPr>
+          <w:sz w:val="28"/>
+          <w:szCs w:val="28"/>
+        </w:rPr>
+        <w:t xml:space="preserve">    return 0;</w:t>
+      </w:r>
+    </w:p>
+    <w:p>
+      <w:pPr>
+        <w:rPr>
+          <w:sz w:val="28"/>
+          <w:szCs w:val="28"/>
+        </w:rPr>
+      </w:pPr>
+      <w:r>
+        <w:rPr>
+          <w:sz w:val="28"/>
+          <w:szCs w:val="28"/>
+        </w:rPr>
+        <w:t>}</w:t>
+      </w:r>
+    </w:p>
+    <w:p>
+      <w:pPr>
+        <w:rPr>
+          <w:sz w:val="28"/>
+          <w:szCs w:val="28"/>
+        </w:rPr>
+      </w:pPr>
       <w:r>
         <w:rPr>
           <w:b/>
@@ -1294,19 +1842,78 @@
           <w:sz w:val="28"/>
           <w:szCs w:val="28"/>
         </w:rPr>
-        <w:t xml:space="preserve"> when a page is loading.&lt;</w:t>
-      </w:r>
-      <w:proofErr w:type="spellStart"/>
-      <w:r>
+        <w:t>Output:</w:t>
+      </w:r>
+    </w:p>
+    <w:p>
+      <w:pPr>
+        <w:rPr>
+          <w:sz w:val="28"/>
+          <w:szCs w:val="28"/>
+        </w:rPr>
+      </w:pPr>
+      <w:r>
+        <w:rPr>
+          <w:sz w:val="28"/>
+          <w:szCs w:val="28"/>
+        </w:rPr>
+        <w:t>0 1 0 1</w:t>
+      </w:r>
+    </w:p>
+    <w:p>
+      <w:pPr>
+        <w:rPr>
+          <w:sz w:val="28"/>
+          <w:szCs w:val="28"/>
+        </w:rPr>
+      </w:pPr>
+      <w:r>
+        <w:rPr>
+          <w:sz w:val="28"/>
+          <w:szCs w:val="28"/>
+        </w:rPr>
+        <w:t>1 0 1 0</w:t>
+      </w:r>
+    </w:p>
+    <w:p>
+      <w:pPr>
+        <w:rPr>
+          <w:sz w:val="28"/>
+          <w:szCs w:val="28"/>
+        </w:rPr>
+      </w:pPr>
+      <w:r>
+        <w:rPr>
+          <w:sz w:val="28"/>
+          <w:szCs w:val="28"/>
+        </w:rPr>
+        <w:t>0 1 0 1</w:t>
+      </w:r>
+    </w:p>
+    <w:p>
+      <w:pPr>
+        <w:rPr>
+          <w:sz w:val="28"/>
+          <w:szCs w:val="28"/>
+        </w:rPr>
+      </w:pPr>
+      <w:r>
+        <w:rPr>
+          <w:sz w:val="28"/>
+          <w:szCs w:val="28"/>
+        </w:rPr>
+        <w:t>1 0 1 0</w:t>
+      </w:r>
+    </w:p>
+    <w:p>
+      <w:pPr>
         <w:rPr>
           <w:b/>
           <w:bCs/>
           <w:sz w:val="28"/>
           <w:szCs w:val="28"/>
         </w:rPr>
-        <w:t>br</w:t>
-      </w:r>
-      <w:proofErr w:type="spellEnd"/>
+      </w:pPr>
       <w:r>
         <w:rPr>
           <w:b/>
@@ -1314,209 +1921,22 @@
           <w:sz w:val="28"/>
           <w:szCs w:val="28"/>
         </w:rPr>
-        <w:t>&gt;&lt;</w:t>
-      </w:r>
-      <w:proofErr w:type="spellStart"/>
-      <w:r>
-        <w:rPr>
-          <w:b/>
-          <w:bCs/>
-          <w:sz w:val="28"/>
-          <w:szCs w:val="28"/>
-        </w:rPr>
-        <w:t>br</w:t>
-      </w:r>
-      <w:proofErr w:type="spellEnd"/>
-      <w:r>
-        <w:rPr>
-          <w:b/>
-          <w:bCs/>
-          <w:sz w:val="28"/>
-          <w:szCs w:val="28"/>
-        </w:rPr>
-        <w:t>&gt;&lt;</w:t>
-      </w:r>
-      <w:proofErr w:type="spellStart"/>
-      <w:r>
-        <w:rPr>
-          <w:b/>
-          <w:bCs/>
-          <w:sz w:val="28"/>
-          <w:szCs w:val="28"/>
-        </w:rPr>
-        <w:t>em</w:t>
-      </w:r>
-      <w:proofErr w:type="spellEnd"/>
-      <w:r>
-        <w:rPr>
-          <w:b/>
-          <w:bCs/>
-          <w:sz w:val="28"/>
-          <w:szCs w:val="28"/>
-        </w:rPr>
-        <w:t xml:space="preserve">&gt;&lt;strong&gt;Hint:&lt;/strong&gt; Use spaces to align the stars in the </w:t>
-      </w:r>
-      <w:proofErr w:type="spellStart"/>
-      <w:r>
-        <w:rPr>
-          <w:b/>
-          <w:bCs/>
-          <w:sz w:val="28"/>
-          <w:szCs w:val="28"/>
-        </w:rPr>
-        <w:t>center</w:t>
-      </w:r>
-      <w:proofErr w:type="spellEnd"/>
-      <w:r>
-        <w:rPr>
-          <w:b/>
-          <w:bCs/>
-          <w:sz w:val="28"/>
-          <w:szCs w:val="28"/>
-        </w:rPr>
-        <w:t xml:space="preserve"> for each row.&lt;/</w:t>
-      </w:r>
-      <w:proofErr w:type="spellStart"/>
-      <w:r>
-        <w:rPr>
-          <w:b/>
-          <w:bCs/>
-          <w:sz w:val="28"/>
-          <w:szCs w:val="28"/>
-        </w:rPr>
-        <w:t>em</w:t>
-      </w:r>
-      <w:proofErr w:type="spellEnd"/>
-      <w:r>
-        <w:rPr>
-          <w:b/>
-          <w:bCs/>
-          <w:sz w:val="28"/>
-          <w:szCs w:val="28"/>
-        </w:rPr>
-        <w:t>&gt;</w:t>
-      </w:r>
-    </w:p>
-    <w:p>
-      <w:pPr>
-        <w:rPr>
-          <w:sz w:val="28"/>
-          <w:szCs w:val="28"/>
-        </w:rPr>
-      </w:pPr>
-      <w:proofErr w:type="spellStart"/>
-      <w:r>
-        <w:rPr>
-          <w:rFonts w:ascii="Nirmala UI" w:hAnsi="Nirmala UI" w:cs="Nirmala UI"/>
-          <w:sz w:val="28"/>
-          <w:szCs w:val="28"/>
-        </w:rPr>
-        <w:t>હા</w:t>
-      </w:r>
-      <w:proofErr w:type="spellEnd"/>
-      <w:r>
-        <w:rPr>
-          <w:sz w:val="28"/>
-          <w:szCs w:val="28"/>
-        </w:rPr>
-        <w:t xml:space="preserve">, </w:t>
-      </w:r>
-      <w:proofErr w:type="spellStart"/>
-      <w:r>
-        <w:rPr>
-          <w:sz w:val="28"/>
-          <w:szCs w:val="28"/>
-        </w:rPr>
-        <w:t>stdio.h</w:t>
-      </w:r>
-      <w:proofErr w:type="spellEnd"/>
-      <w:r>
-        <w:rPr>
-          <w:sz w:val="28"/>
-          <w:szCs w:val="28"/>
-        </w:rPr>
-        <w:t xml:space="preserve"> </w:t>
-      </w:r>
-      <w:proofErr w:type="spellStart"/>
-      <w:r>
-        <w:rPr>
-          <w:rFonts w:ascii="Nirmala UI" w:hAnsi="Nirmala UI" w:cs="Nirmala UI"/>
-          <w:sz w:val="28"/>
-          <w:szCs w:val="28"/>
-        </w:rPr>
-        <w:t>વાળી</w:t>
-      </w:r>
-      <w:proofErr w:type="spellEnd"/>
-      <w:r>
-        <w:rPr>
-          <w:sz w:val="28"/>
-          <w:szCs w:val="28"/>
-        </w:rPr>
-        <w:t xml:space="preserve"> </w:t>
-      </w:r>
-      <w:r>
-        <w:rPr>
-          <w:b/>
-          <w:bCs/>
-          <w:sz w:val="28"/>
-          <w:szCs w:val="28"/>
-        </w:rPr>
-        <w:t>easy C/C++ style</w:t>
-      </w:r>
-      <w:r>
-        <w:rPr>
-          <w:sz w:val="28"/>
-          <w:szCs w:val="28"/>
-        </w:rPr>
-        <w:t xml:space="preserve"> </w:t>
-      </w:r>
-      <w:proofErr w:type="spellStart"/>
-      <w:r>
-        <w:rPr>
-          <w:rFonts w:ascii="Nirmala UI" w:hAnsi="Nirmala UI" w:cs="Nirmala UI"/>
-          <w:sz w:val="28"/>
-          <w:szCs w:val="28"/>
-        </w:rPr>
-        <w:t>માં</w:t>
-      </w:r>
-      <w:proofErr w:type="spellEnd"/>
-      <w:r>
-        <w:rPr>
-          <w:sz w:val="28"/>
-          <w:szCs w:val="28"/>
-        </w:rPr>
-        <w:t>:</w:t>
-      </w:r>
-    </w:p>
-    <w:p>
-      <w:pPr>
-        <w:rPr>
-          <w:sz w:val="28"/>
-          <w:szCs w:val="28"/>
-        </w:rPr>
-      </w:pPr>
-      <w:r>
-        <w:rPr>
-          <w:sz w:val="28"/>
-          <w:szCs w:val="28"/>
-        </w:rPr>
-        <w:t>#include &lt;</w:t>
-      </w:r>
-      <w:proofErr w:type="spellStart"/>
-      <w:r>
-        <w:rPr>
-          <w:sz w:val="28"/>
-          <w:szCs w:val="28"/>
-        </w:rPr>
-        <w:t>stdio.h</w:t>
-      </w:r>
-      <w:proofErr w:type="spellEnd"/>
-      <w:r>
-        <w:rPr>
-          <w:sz w:val="28"/>
-          <w:szCs w:val="28"/>
-        </w:rPr>
-        <w:t>&gt;</w:t>
+        <w:t>5.Modify your pyramid pattern code to accept the number of rows as user input, so the user can set the height of the pyramid before printing.</w:t>
+      </w:r>
+    </w:p>
+    <w:p>
+      <w:pPr>
+        <w:rPr>
+          <w:sz w:val="28"/>
+          <w:szCs w:val="28"/>
+        </w:rPr>
+      </w:pPr>
+      <w:r>
+        <w:rPr>
+          <w:sz w:val="28"/>
+          <w:szCs w:val="28"/>
+        </w:rPr>
+        <w:t>#include &lt;stdio.h&gt;</w:t>
       </w:r>
     </w:p>
     <w:p>
@@ -1569,94 +1989,53 @@
           <w:sz w:val="28"/>
           <w:szCs w:val="28"/>
         </w:rPr>
-        <w:t xml:space="preserve">    int </w:t>
-      </w:r>
-      <w:proofErr w:type="spellStart"/>
-      <w:r>
-        <w:rPr>
-          <w:sz w:val="28"/>
-          <w:szCs w:val="28"/>
-        </w:rPr>
-        <w:t>i</w:t>
-      </w:r>
-      <w:proofErr w:type="spellEnd"/>
-      <w:r>
-        <w:rPr>
-          <w:sz w:val="28"/>
-          <w:szCs w:val="28"/>
-        </w:rPr>
-        <w:t>, j;</w:t>
-      </w:r>
-    </w:p>
-    <w:p>
-      <w:pPr>
-        <w:rPr>
-          <w:sz w:val="28"/>
-          <w:szCs w:val="28"/>
-        </w:rPr>
-      </w:pPr>
-    </w:p>
-    <w:p>
-      <w:pPr>
-        <w:rPr>
-          <w:sz w:val="28"/>
-          <w:szCs w:val="28"/>
-        </w:rPr>
-      </w:pPr>
-      <w:r>
-        <w:rPr>
-          <w:sz w:val="28"/>
-          <w:szCs w:val="28"/>
-        </w:rPr>
-        <w:t xml:space="preserve">    for(</w:t>
-      </w:r>
-      <w:proofErr w:type="spellStart"/>
-      <w:r>
-        <w:rPr>
-          <w:sz w:val="28"/>
-          <w:szCs w:val="28"/>
-        </w:rPr>
-        <w:t>i</w:t>
-      </w:r>
-      <w:proofErr w:type="spellEnd"/>
-      <w:r>
-        <w:rPr>
-          <w:sz w:val="28"/>
-          <w:szCs w:val="28"/>
-        </w:rPr>
-        <w:t xml:space="preserve"> = 1; </w:t>
-      </w:r>
-      <w:proofErr w:type="spellStart"/>
-      <w:r>
-        <w:rPr>
-          <w:sz w:val="28"/>
-          <w:szCs w:val="28"/>
-        </w:rPr>
-        <w:t>i</w:t>
-      </w:r>
-      <w:proofErr w:type="spellEnd"/>
-      <w:r>
-        <w:rPr>
-          <w:sz w:val="28"/>
-          <w:szCs w:val="28"/>
-        </w:rPr>
-        <w:t xml:space="preserve"> &lt;= 6; </w:t>
-      </w:r>
-      <w:proofErr w:type="spellStart"/>
-      <w:r>
-        <w:rPr>
-          <w:sz w:val="28"/>
-          <w:szCs w:val="28"/>
-        </w:rPr>
-        <w:t>i</w:t>
-      </w:r>
-      <w:proofErr w:type="spellEnd"/>
-      <w:r>
-        <w:rPr>
-          <w:sz w:val="28"/>
-          <w:szCs w:val="28"/>
-        </w:rPr>
-        <w:t>++)</w:t>
+        <w:t xml:space="preserve">    int i, j, rows;</w:t>
+      </w:r>
+    </w:p>
+    <w:p>
+      <w:pPr>
+        <w:rPr>
+          <w:sz w:val="28"/>
+          <w:szCs w:val="28"/>
+        </w:rPr>
+      </w:pPr>
+    </w:p>
+    <w:p>
+      <w:pPr>
+        <w:rPr>
+          <w:sz w:val="28"/>
+          <w:szCs w:val="28"/>
+        </w:rPr>
+      </w:pPr>
+      <w:r>
+        <w:rPr>
+          <w:sz w:val="28"/>
+          <w:szCs w:val="28"/>
+        </w:rPr>
+        <w:t xml:space="preserve">    scanf("%d", &amp;rows);</w:t>
+      </w:r>
+    </w:p>
+    <w:p>
+      <w:pPr>
+        <w:rPr>
+          <w:sz w:val="28"/>
+          <w:szCs w:val="28"/>
+        </w:rPr>
+      </w:pPr>
+    </w:p>
+    <w:p>
+      <w:pPr>
+        <w:rPr>
+          <w:sz w:val="28"/>
+          <w:szCs w:val="28"/>
+        </w:rPr>
+      </w:pPr>
+      <w:r>
+        <w:rPr>
+          <w:sz w:val="28"/>
+          <w:szCs w:val="28"/>
+        </w:rPr>
+        <w:t xml:space="preserve">    for(i = 1; i &lt;= rows; i++)</w:t>
       </w:r>
     </w:p>
     <w:p>
@@ -1686,54 +2065,7 @@
           <w:sz w:val="28"/>
           <w:szCs w:val="28"/>
         </w:rPr>
-        <w:t xml:space="preserve">        // Print spaces</w:t>
-      </w:r>
-    </w:p>
-    <w:p>
-      <w:pPr>
-        <w:rPr>
-          <w:sz w:val="28"/>
-          <w:szCs w:val="28"/>
-        </w:rPr>
-      </w:pPr>
-      <w:r>
-        <w:rPr>
-          <w:sz w:val="28"/>
-          <w:szCs w:val="28"/>
-        </w:rPr>
-        <w:t xml:space="preserve">        for(j = 1; j &lt;= 6 - </w:t>
-      </w:r>
-      <w:proofErr w:type="spellStart"/>
-      <w:r>
-        <w:rPr>
-          <w:sz w:val="28"/>
-          <w:szCs w:val="28"/>
-        </w:rPr>
-        <w:t>i</w:t>
-      </w:r>
-      <w:proofErr w:type="spellEnd"/>
-      <w:r>
-        <w:rPr>
-          <w:sz w:val="28"/>
-          <w:szCs w:val="28"/>
-        </w:rPr>
-        <w:t xml:space="preserve">; </w:t>
-      </w:r>
-      <w:proofErr w:type="spellStart"/>
-      <w:r>
-        <w:rPr>
-          <w:sz w:val="28"/>
-          <w:szCs w:val="28"/>
-        </w:rPr>
-        <w:t>j++</w:t>
-      </w:r>
-      <w:proofErr w:type="spellEnd"/>
-      <w:r>
-        <w:rPr>
-          <w:sz w:val="28"/>
-          <w:szCs w:val="28"/>
-        </w:rPr>
-        <w:t>)</w:t>
+        <w:t xml:space="preserve">        for(j = 1; j &lt;= rows - i; j++)</w:t>
       </w:r>
     </w:p>
     <w:p>
@@ -1763,37 +2095,22 @@
           <w:sz w:val="28"/>
           <w:szCs w:val="28"/>
         </w:rPr>
-        <w:t xml:space="preserve">            </w:t>
-      </w:r>
-      <w:proofErr w:type="spellStart"/>
-      <w:r>
-        <w:rPr>
-          <w:sz w:val="28"/>
-          <w:szCs w:val="28"/>
-        </w:rPr>
-        <w:t>printf</w:t>
-      </w:r>
-      <w:proofErr w:type="spellEnd"/>
-      <w:r>
-        <w:rPr>
-          <w:sz w:val="28"/>
-          <w:szCs w:val="28"/>
-        </w:rPr>
-        <w:t>(" ");</w:t>
-      </w:r>
-    </w:p>
-    <w:p>
-      <w:pPr>
-        <w:rPr>
-          <w:sz w:val="28"/>
-          <w:szCs w:val="28"/>
-        </w:rPr>
-      </w:pPr>
-      <w:r>
-        <w:rPr>
-          <w:sz w:val="28"/>
-          <w:szCs w:val="28"/>
-        </w:rPr>
+        <w:t xml:space="preserve">            printf(" ");</w:t>
+      </w:r>
+    </w:p>
+    <w:p>
+      <w:pPr>
+        <w:rPr>
+          <w:sz w:val="28"/>
+          <w:szCs w:val="28"/>
+        </w:rPr>
+      </w:pPr>
+      <w:r>
+        <w:rPr>
+          <w:sz w:val="28"/>
+          <w:szCs w:val="28"/>
+        </w:rPr>
+        <w:lastRenderedPageBreak/>
         <w:t xml:space="preserve">        }</w:t>
       </w:r>
     </w:p>
@@ -1817,54 +2134,7 @@
           <w:sz w:val="28"/>
           <w:szCs w:val="28"/>
         </w:rPr>
-        <w:t xml:space="preserve">        // Print stars</w:t>
-      </w:r>
-    </w:p>
-    <w:p>
-      <w:pPr>
-        <w:rPr>
-          <w:sz w:val="28"/>
-          <w:szCs w:val="28"/>
-        </w:rPr>
-      </w:pPr>
-      <w:r>
-        <w:rPr>
-          <w:sz w:val="28"/>
-          <w:szCs w:val="28"/>
-        </w:rPr>
-        <w:t xml:space="preserve">        for(j = 1; j &lt;= 2 * </w:t>
-      </w:r>
-      <w:proofErr w:type="spellStart"/>
-      <w:r>
-        <w:rPr>
-          <w:sz w:val="28"/>
-          <w:szCs w:val="28"/>
-        </w:rPr>
-        <w:t>i</w:t>
-      </w:r>
-      <w:proofErr w:type="spellEnd"/>
-      <w:r>
-        <w:rPr>
-          <w:sz w:val="28"/>
-          <w:szCs w:val="28"/>
-        </w:rPr>
-        <w:t xml:space="preserve"> - 1; </w:t>
-      </w:r>
-      <w:proofErr w:type="spellStart"/>
-      <w:r>
-        <w:rPr>
-          <w:sz w:val="28"/>
-          <w:szCs w:val="28"/>
-        </w:rPr>
-        <w:t>j++</w:t>
-      </w:r>
-      <w:proofErr w:type="spellEnd"/>
-      <w:r>
-        <w:rPr>
-          <w:sz w:val="28"/>
-          <w:szCs w:val="28"/>
-        </w:rPr>
-        <w:t>)</w:t>
+        <w:t xml:space="preserve">        for(j = 1; j &lt;= 2 * i - 1; j++)</w:t>
       </w:r>
     </w:p>
     <w:p>
@@ -1894,23 +2164,7 @@
           <w:sz w:val="28"/>
           <w:szCs w:val="28"/>
         </w:rPr>
-        <w:t xml:space="preserve">            </w:t>
-      </w:r>
-      <w:proofErr w:type="spellStart"/>
-      <w:r>
-        <w:rPr>
-          <w:sz w:val="28"/>
-          <w:szCs w:val="28"/>
-        </w:rPr>
-        <w:t>printf</w:t>
-      </w:r>
-      <w:proofErr w:type="spellEnd"/>
-      <w:r>
-        <w:rPr>
-          <w:sz w:val="28"/>
-          <w:szCs w:val="28"/>
-        </w:rPr>
-        <w:t>("*");</w:t>
+        <w:t xml:space="preserve">            printf("*");</w:t>
       </w:r>
     </w:p>
     <w:p>
@@ -1948,1243 +2202,7 @@
           <w:sz w:val="28"/>
           <w:szCs w:val="28"/>
         </w:rPr>
-        <w:t xml:space="preserve">        </w:t>
-      </w:r>
-      <w:proofErr w:type="spellStart"/>
-      <w:r>
-        <w:rPr>
-          <w:sz w:val="28"/>
-          <w:szCs w:val="28"/>
-        </w:rPr>
-        <w:t>printf</w:t>
-      </w:r>
-      <w:proofErr w:type="spellEnd"/>
-      <w:r>
-        <w:rPr>
-          <w:sz w:val="28"/>
-          <w:szCs w:val="28"/>
-        </w:rPr>
-        <w:t>("\n");</w:t>
-      </w:r>
-    </w:p>
-    <w:p>
-      <w:pPr>
-        <w:rPr>
-          <w:sz w:val="28"/>
-          <w:szCs w:val="28"/>
-        </w:rPr>
-      </w:pPr>
-      <w:r>
-        <w:rPr>
-          <w:sz w:val="28"/>
-          <w:szCs w:val="28"/>
-        </w:rPr>
-        <w:t xml:space="preserve">    }</w:t>
-      </w:r>
-    </w:p>
-    <w:p>
-      <w:pPr>
-        <w:rPr>
-          <w:sz w:val="28"/>
-          <w:szCs w:val="28"/>
-        </w:rPr>
-      </w:pPr>
-    </w:p>
-    <w:p>
-      <w:pPr>
-        <w:rPr>
-          <w:sz w:val="28"/>
-          <w:szCs w:val="28"/>
-        </w:rPr>
-      </w:pPr>
-      <w:r>
-        <w:rPr>
-          <w:sz w:val="28"/>
-          <w:szCs w:val="28"/>
-        </w:rPr>
-        <w:t xml:space="preserve">    return 0;</w:t>
-      </w:r>
-    </w:p>
-    <w:p>
-      <w:pPr>
-        <w:rPr>
-          <w:sz w:val="28"/>
-          <w:szCs w:val="28"/>
-        </w:rPr>
-      </w:pPr>
-      <w:r>
-        <w:rPr>
-          <w:sz w:val="28"/>
-          <w:szCs w:val="28"/>
-        </w:rPr>
-        <w:t>}</w:t>
-      </w:r>
-    </w:p>
-    <w:p>
-      <w:pPr>
-        <w:rPr>
-          <w:sz w:val="28"/>
-          <w:szCs w:val="28"/>
-        </w:rPr>
-      </w:pPr>
-      <w:r>
-        <w:rPr>
-          <w:b/>
-          <w:bCs/>
-          <w:sz w:val="28"/>
-          <w:szCs w:val="28"/>
-        </w:rPr>
-        <w:t>Output:</w:t>
-      </w:r>
-    </w:p>
-    <w:p>
-      <w:pPr>
-        <w:rPr>
-          <w:sz w:val="28"/>
-          <w:szCs w:val="28"/>
-        </w:rPr>
-      </w:pPr>
-      <w:r>
-        <w:rPr>
-          <w:sz w:val="28"/>
-          <w:szCs w:val="28"/>
-        </w:rPr>
-        <w:t xml:space="preserve">     *</w:t>
-      </w:r>
-    </w:p>
-    <w:p>
-      <w:pPr>
-        <w:rPr>
-          <w:sz w:val="28"/>
-          <w:szCs w:val="28"/>
-        </w:rPr>
-      </w:pPr>
-      <w:r>
-        <w:rPr>
-          <w:sz w:val="28"/>
-          <w:szCs w:val="28"/>
-        </w:rPr>
-        <w:t xml:space="preserve">    ***</w:t>
-      </w:r>
-    </w:p>
-    <w:p>
-      <w:pPr>
-        <w:rPr>
-          <w:sz w:val="28"/>
-          <w:szCs w:val="28"/>
-        </w:rPr>
-      </w:pPr>
-      <w:r>
-        <w:rPr>
-          <w:sz w:val="28"/>
-          <w:szCs w:val="28"/>
-        </w:rPr>
-        <w:t xml:space="preserve">   *****</w:t>
-      </w:r>
-    </w:p>
-    <w:p>
-      <w:pPr>
-        <w:rPr>
-          <w:sz w:val="28"/>
-          <w:szCs w:val="28"/>
-        </w:rPr>
-      </w:pPr>
-      <w:r>
-        <w:rPr>
-          <w:sz w:val="28"/>
-          <w:szCs w:val="28"/>
-        </w:rPr>
-        <w:t xml:space="preserve">  *******</w:t>
-      </w:r>
-    </w:p>
-    <w:p>
-      <w:pPr>
-        <w:rPr>
-          <w:sz w:val="28"/>
-          <w:szCs w:val="28"/>
-        </w:rPr>
-      </w:pPr>
-      <w:r>
-        <w:rPr>
-          <w:sz w:val="28"/>
-          <w:szCs w:val="28"/>
-        </w:rPr>
-        <w:t xml:space="preserve"> *********</w:t>
-      </w:r>
-    </w:p>
-    <w:p>
-      <w:pPr>
-        <w:rPr>
-          <w:sz w:val="28"/>
-          <w:szCs w:val="28"/>
-        </w:rPr>
-      </w:pPr>
-      <w:r>
-        <w:rPr>
-          <w:sz w:val="28"/>
-          <w:szCs w:val="28"/>
-        </w:rPr>
-        <w:t>***********</w:t>
-      </w:r>
-    </w:p>
-    <w:p>
-      <w:pPr>
-        <w:rPr>
-          <w:sz w:val="28"/>
-          <w:szCs w:val="28"/>
-        </w:rPr>
-      </w:pPr>
-    </w:p>
-    <w:p>
-      <w:pPr>
-        <w:rPr>
-          <w:b/>
-          <w:bCs/>
-          <w:sz w:val="28"/>
-          <w:szCs w:val="28"/>
-        </w:rPr>
-      </w:pPr>
-      <w:r>
-        <w:rPr>
-          <w:b/>
-          <w:bCs/>
-          <w:sz w:val="28"/>
-          <w:szCs w:val="28"/>
-        </w:rPr>
-        <w:t>4.Write code using nested loops to print a pattern of alternating 0s and 1s in a grid, like the checkered background seen in some Spotify playlist covers (e.g., for a 4x4 grid, alternate 0 and 1 in each cell).</w:t>
-      </w:r>
-    </w:p>
-    <w:p>
-      <w:pPr>
-        <w:rPr>
-          <w:sz w:val="28"/>
-          <w:szCs w:val="28"/>
-        </w:rPr>
-      </w:pPr>
-      <w:r>
-        <w:rPr>
-          <w:sz w:val="28"/>
-          <w:szCs w:val="28"/>
-        </w:rPr>
-        <w:t>#include &lt;</w:t>
-      </w:r>
-      <w:proofErr w:type="spellStart"/>
-      <w:r>
-        <w:rPr>
-          <w:sz w:val="28"/>
-          <w:szCs w:val="28"/>
-        </w:rPr>
-        <w:t>stdio.h</w:t>
-      </w:r>
-      <w:proofErr w:type="spellEnd"/>
-      <w:r>
-        <w:rPr>
-          <w:sz w:val="28"/>
-          <w:szCs w:val="28"/>
-        </w:rPr>
-        <w:t>&gt;</w:t>
-      </w:r>
-    </w:p>
-    <w:p>
-      <w:pPr>
-        <w:rPr>
-          <w:sz w:val="28"/>
-          <w:szCs w:val="28"/>
-        </w:rPr>
-      </w:pPr>
-    </w:p>
-    <w:p>
-      <w:pPr>
-        <w:rPr>
-          <w:sz w:val="28"/>
-          <w:szCs w:val="28"/>
-        </w:rPr>
-      </w:pPr>
-      <w:r>
-        <w:rPr>
-          <w:sz w:val="28"/>
-          <w:szCs w:val="28"/>
-        </w:rPr>
-        <w:t>int main()</w:t>
-      </w:r>
-    </w:p>
-    <w:p>
-      <w:pPr>
-        <w:rPr>
-          <w:sz w:val="28"/>
-          <w:szCs w:val="28"/>
-        </w:rPr>
-      </w:pPr>
-      <w:r>
-        <w:rPr>
-          <w:sz w:val="28"/>
-          <w:szCs w:val="28"/>
-        </w:rPr>
-        <w:t>{</w:t>
-      </w:r>
-    </w:p>
-    <w:p>
-      <w:pPr>
-        <w:rPr>
-          <w:sz w:val="28"/>
-          <w:szCs w:val="28"/>
-        </w:rPr>
-      </w:pPr>
-      <w:r>
-        <w:rPr>
-          <w:sz w:val="28"/>
-          <w:szCs w:val="28"/>
-        </w:rPr>
-        <w:t xml:space="preserve">    int </w:t>
-      </w:r>
-      <w:proofErr w:type="spellStart"/>
-      <w:r>
-        <w:rPr>
-          <w:sz w:val="28"/>
-          <w:szCs w:val="28"/>
-        </w:rPr>
-        <w:t>i</w:t>
-      </w:r>
-      <w:proofErr w:type="spellEnd"/>
-      <w:r>
-        <w:rPr>
-          <w:sz w:val="28"/>
-          <w:szCs w:val="28"/>
-        </w:rPr>
-        <w:t>, j;</w:t>
-      </w:r>
-    </w:p>
-    <w:p>
-      <w:pPr>
-        <w:rPr>
-          <w:sz w:val="28"/>
-          <w:szCs w:val="28"/>
-        </w:rPr>
-      </w:pPr>
-    </w:p>
-    <w:p>
-      <w:pPr>
-        <w:rPr>
-          <w:sz w:val="28"/>
-          <w:szCs w:val="28"/>
-        </w:rPr>
-      </w:pPr>
-      <w:r>
-        <w:rPr>
-          <w:sz w:val="28"/>
-          <w:szCs w:val="28"/>
-        </w:rPr>
-        <w:t xml:space="preserve">    for(</w:t>
-      </w:r>
-      <w:proofErr w:type="spellStart"/>
-      <w:r>
-        <w:rPr>
-          <w:sz w:val="28"/>
-          <w:szCs w:val="28"/>
-        </w:rPr>
-        <w:t>i</w:t>
-      </w:r>
-      <w:proofErr w:type="spellEnd"/>
-      <w:r>
-        <w:rPr>
-          <w:sz w:val="28"/>
-          <w:szCs w:val="28"/>
-        </w:rPr>
-        <w:t xml:space="preserve"> = 1; </w:t>
-      </w:r>
-      <w:proofErr w:type="spellStart"/>
-      <w:r>
-        <w:rPr>
-          <w:sz w:val="28"/>
-          <w:szCs w:val="28"/>
-        </w:rPr>
-        <w:t>i</w:t>
-      </w:r>
-      <w:proofErr w:type="spellEnd"/>
-      <w:r>
-        <w:rPr>
-          <w:sz w:val="28"/>
-          <w:szCs w:val="28"/>
-        </w:rPr>
-        <w:t xml:space="preserve"> &lt;= 4; </w:t>
-      </w:r>
-      <w:proofErr w:type="spellStart"/>
-      <w:r>
-        <w:rPr>
-          <w:sz w:val="28"/>
-          <w:szCs w:val="28"/>
-        </w:rPr>
-        <w:t>i</w:t>
-      </w:r>
-      <w:proofErr w:type="spellEnd"/>
-      <w:r>
-        <w:rPr>
-          <w:sz w:val="28"/>
-          <w:szCs w:val="28"/>
-        </w:rPr>
-        <w:t>++)</w:t>
-      </w:r>
-    </w:p>
-    <w:p>
-      <w:pPr>
-        <w:rPr>
-          <w:sz w:val="28"/>
-          <w:szCs w:val="28"/>
-        </w:rPr>
-      </w:pPr>
-      <w:r>
-        <w:rPr>
-          <w:sz w:val="28"/>
-          <w:szCs w:val="28"/>
-        </w:rPr>
-        <w:t xml:space="preserve">    {</w:t>
-      </w:r>
-    </w:p>
-    <w:p>
-      <w:pPr>
-        <w:rPr>
-          <w:sz w:val="28"/>
-          <w:szCs w:val="28"/>
-        </w:rPr>
-      </w:pPr>
-      <w:r>
-        <w:rPr>
-          <w:sz w:val="28"/>
-          <w:szCs w:val="28"/>
-        </w:rPr>
-        <w:t xml:space="preserve">        for(j = 1; j &lt;= 4; </w:t>
-      </w:r>
-      <w:proofErr w:type="spellStart"/>
-      <w:r>
-        <w:rPr>
-          <w:sz w:val="28"/>
-          <w:szCs w:val="28"/>
-        </w:rPr>
-        <w:t>j++</w:t>
-      </w:r>
-      <w:proofErr w:type="spellEnd"/>
-      <w:r>
-        <w:rPr>
-          <w:sz w:val="28"/>
-          <w:szCs w:val="28"/>
-        </w:rPr>
-        <w:t>)</w:t>
-      </w:r>
-    </w:p>
-    <w:p>
-      <w:pPr>
-        <w:rPr>
-          <w:sz w:val="28"/>
-          <w:szCs w:val="28"/>
-        </w:rPr>
-      </w:pPr>
-      <w:r>
-        <w:rPr>
-          <w:sz w:val="28"/>
-          <w:szCs w:val="28"/>
-        </w:rPr>
-        <w:t xml:space="preserve">        {</w:t>
-      </w:r>
-    </w:p>
-    <w:p>
-      <w:pPr>
-        <w:rPr>
-          <w:sz w:val="28"/>
-          <w:szCs w:val="28"/>
-        </w:rPr>
-      </w:pPr>
-      <w:r>
-        <w:rPr>
-          <w:sz w:val="28"/>
-          <w:szCs w:val="28"/>
-        </w:rPr>
-        <w:t xml:space="preserve">            if((</w:t>
-      </w:r>
-      <w:proofErr w:type="spellStart"/>
-      <w:r>
-        <w:rPr>
-          <w:sz w:val="28"/>
-          <w:szCs w:val="28"/>
-        </w:rPr>
-        <w:t>i</w:t>
-      </w:r>
-      <w:proofErr w:type="spellEnd"/>
-      <w:r>
-        <w:rPr>
-          <w:sz w:val="28"/>
-          <w:szCs w:val="28"/>
-        </w:rPr>
-        <w:t xml:space="preserve"> + j) % 2 == 0)</w:t>
-      </w:r>
-    </w:p>
-    <w:p>
-      <w:pPr>
-        <w:rPr>
-          <w:sz w:val="28"/>
-          <w:szCs w:val="28"/>
-        </w:rPr>
-      </w:pPr>
-      <w:r>
-        <w:rPr>
-          <w:sz w:val="28"/>
-          <w:szCs w:val="28"/>
-        </w:rPr>
-        <w:t xml:space="preserve">                </w:t>
-      </w:r>
-      <w:proofErr w:type="spellStart"/>
-      <w:r>
-        <w:rPr>
-          <w:sz w:val="28"/>
-          <w:szCs w:val="28"/>
-        </w:rPr>
-        <w:t>printf</w:t>
-      </w:r>
-      <w:proofErr w:type="spellEnd"/>
-      <w:r>
-        <w:rPr>
-          <w:sz w:val="28"/>
-          <w:szCs w:val="28"/>
-        </w:rPr>
-        <w:t>("0 ");</w:t>
-      </w:r>
-    </w:p>
-    <w:p>
-      <w:pPr>
-        <w:rPr>
-          <w:sz w:val="28"/>
-          <w:szCs w:val="28"/>
-        </w:rPr>
-      </w:pPr>
-      <w:r>
-        <w:rPr>
-          <w:sz w:val="28"/>
-          <w:szCs w:val="28"/>
-        </w:rPr>
-        <w:t xml:space="preserve">            else</w:t>
-      </w:r>
-    </w:p>
-    <w:p>
-      <w:pPr>
-        <w:rPr>
-          <w:sz w:val="28"/>
-          <w:szCs w:val="28"/>
-        </w:rPr>
-      </w:pPr>
-      <w:r>
-        <w:rPr>
-          <w:sz w:val="28"/>
-          <w:szCs w:val="28"/>
-        </w:rPr>
-        <w:lastRenderedPageBreak/>
-        <w:t xml:space="preserve">                </w:t>
-      </w:r>
-      <w:proofErr w:type="spellStart"/>
-      <w:r>
-        <w:rPr>
-          <w:sz w:val="28"/>
-          <w:szCs w:val="28"/>
-        </w:rPr>
-        <w:t>printf</w:t>
-      </w:r>
-      <w:proofErr w:type="spellEnd"/>
-      <w:r>
-        <w:rPr>
-          <w:sz w:val="28"/>
-          <w:szCs w:val="28"/>
-        </w:rPr>
-        <w:t>("1 ");</w:t>
-      </w:r>
-    </w:p>
-    <w:p>
-      <w:pPr>
-        <w:rPr>
-          <w:sz w:val="28"/>
-          <w:szCs w:val="28"/>
-        </w:rPr>
-      </w:pPr>
-      <w:r>
-        <w:rPr>
-          <w:sz w:val="28"/>
-          <w:szCs w:val="28"/>
-        </w:rPr>
-        <w:t xml:space="preserve">        }</w:t>
-      </w:r>
-    </w:p>
-    <w:p>
-      <w:pPr>
-        <w:rPr>
-          <w:sz w:val="28"/>
-          <w:szCs w:val="28"/>
-        </w:rPr>
-      </w:pPr>
-    </w:p>
-    <w:p>
-      <w:pPr>
-        <w:rPr>
-          <w:sz w:val="28"/>
-          <w:szCs w:val="28"/>
-        </w:rPr>
-      </w:pPr>
-      <w:r>
-        <w:rPr>
-          <w:sz w:val="28"/>
-          <w:szCs w:val="28"/>
-        </w:rPr>
-        <w:t xml:space="preserve">        </w:t>
-      </w:r>
-      <w:proofErr w:type="spellStart"/>
-      <w:r>
-        <w:rPr>
-          <w:sz w:val="28"/>
-          <w:szCs w:val="28"/>
-        </w:rPr>
-        <w:t>printf</w:t>
-      </w:r>
-      <w:proofErr w:type="spellEnd"/>
-      <w:r>
-        <w:rPr>
-          <w:sz w:val="28"/>
-          <w:szCs w:val="28"/>
-        </w:rPr>
-        <w:t>("\n");</w:t>
-      </w:r>
-    </w:p>
-    <w:p>
-      <w:pPr>
-        <w:rPr>
-          <w:sz w:val="28"/>
-          <w:szCs w:val="28"/>
-        </w:rPr>
-      </w:pPr>
-      <w:r>
-        <w:rPr>
-          <w:sz w:val="28"/>
-          <w:szCs w:val="28"/>
-        </w:rPr>
-        <w:t xml:space="preserve">    }</w:t>
-      </w:r>
-    </w:p>
-    <w:p>
-      <w:pPr>
-        <w:rPr>
-          <w:sz w:val="28"/>
-          <w:szCs w:val="28"/>
-        </w:rPr>
-      </w:pPr>
-    </w:p>
-    <w:p>
-      <w:pPr>
-        <w:rPr>
-          <w:sz w:val="28"/>
-          <w:szCs w:val="28"/>
-        </w:rPr>
-      </w:pPr>
-      <w:r>
-        <w:rPr>
-          <w:sz w:val="28"/>
-          <w:szCs w:val="28"/>
-        </w:rPr>
-        <w:t xml:space="preserve">    return 0;</w:t>
-      </w:r>
-    </w:p>
-    <w:p>
-      <w:pPr>
-        <w:rPr>
-          <w:sz w:val="28"/>
-          <w:szCs w:val="28"/>
-        </w:rPr>
-      </w:pPr>
-      <w:r>
-        <w:rPr>
-          <w:sz w:val="28"/>
-          <w:szCs w:val="28"/>
-        </w:rPr>
-        <w:t>}</w:t>
-      </w:r>
-    </w:p>
-    <w:p>
-      <w:pPr>
-        <w:rPr>
-          <w:sz w:val="28"/>
-          <w:szCs w:val="28"/>
-        </w:rPr>
-      </w:pPr>
-      <w:r>
-        <w:rPr>
-          <w:b/>
-          <w:bCs/>
-          <w:sz w:val="28"/>
-          <w:szCs w:val="28"/>
-        </w:rPr>
-        <w:t>Output:</w:t>
-      </w:r>
-    </w:p>
-    <w:p>
-      <w:pPr>
-        <w:rPr>
-          <w:sz w:val="28"/>
-          <w:szCs w:val="28"/>
-        </w:rPr>
-      </w:pPr>
-      <w:r>
-        <w:rPr>
-          <w:sz w:val="28"/>
-          <w:szCs w:val="28"/>
-        </w:rPr>
-        <w:t>0 1 0 1</w:t>
-      </w:r>
-    </w:p>
-    <w:p>
-      <w:pPr>
-        <w:rPr>
-          <w:sz w:val="28"/>
-          <w:szCs w:val="28"/>
-        </w:rPr>
-      </w:pPr>
-      <w:r>
-        <w:rPr>
-          <w:sz w:val="28"/>
-          <w:szCs w:val="28"/>
-        </w:rPr>
-        <w:t>1 0 1 0</w:t>
-      </w:r>
-    </w:p>
-    <w:p>
-      <w:pPr>
-        <w:rPr>
-          <w:sz w:val="28"/>
-          <w:szCs w:val="28"/>
-        </w:rPr>
-      </w:pPr>
-      <w:r>
-        <w:rPr>
-          <w:sz w:val="28"/>
-          <w:szCs w:val="28"/>
-        </w:rPr>
-        <w:t>0 1 0 1</w:t>
-      </w:r>
-    </w:p>
-    <w:p>
-      <w:pPr>
-        <w:rPr>
-          <w:sz w:val="28"/>
-          <w:szCs w:val="28"/>
-        </w:rPr>
-      </w:pPr>
-      <w:r>
-        <w:rPr>
-          <w:sz w:val="28"/>
-          <w:szCs w:val="28"/>
-        </w:rPr>
-        <w:t>1 0 1 0</w:t>
-      </w:r>
-    </w:p>
-    <w:p>
-      <w:pPr>
-        <w:rPr>
-          <w:b/>
-          <w:bCs/>
-          <w:sz w:val="28"/>
-          <w:szCs w:val="28"/>
-        </w:rPr>
-      </w:pPr>
-      <w:r>
-        <w:rPr>
-          <w:b/>
-          <w:bCs/>
-          <w:sz w:val="28"/>
-          <w:szCs w:val="28"/>
-        </w:rPr>
-        <w:t>5.Modify your pyramid pattern code to accept the number of rows as user input, so the user can set the height of the pyramid before printing.</w:t>
-      </w:r>
-    </w:p>
-    <w:p>
-      <w:pPr>
-        <w:rPr>
-          <w:sz w:val="28"/>
-          <w:szCs w:val="28"/>
-        </w:rPr>
-      </w:pPr>
-      <w:r>
-        <w:rPr>
-          <w:sz w:val="28"/>
-          <w:szCs w:val="28"/>
-        </w:rPr>
-        <w:t>#include &lt;</w:t>
-      </w:r>
-      <w:proofErr w:type="spellStart"/>
-      <w:r>
-        <w:rPr>
-          <w:sz w:val="28"/>
-          <w:szCs w:val="28"/>
-        </w:rPr>
-        <w:t>stdio.h</w:t>
-      </w:r>
-      <w:proofErr w:type="spellEnd"/>
-      <w:r>
-        <w:rPr>
-          <w:sz w:val="28"/>
-          <w:szCs w:val="28"/>
-        </w:rPr>
-        <w:t>&gt;</w:t>
-      </w:r>
-    </w:p>
-    <w:p>
-      <w:pPr>
-        <w:rPr>
-          <w:sz w:val="28"/>
-          <w:szCs w:val="28"/>
-        </w:rPr>
-      </w:pPr>
-    </w:p>
-    <w:p>
-      <w:pPr>
-        <w:rPr>
-          <w:sz w:val="28"/>
-          <w:szCs w:val="28"/>
-        </w:rPr>
-      </w:pPr>
-      <w:r>
-        <w:rPr>
-          <w:sz w:val="28"/>
-          <w:szCs w:val="28"/>
-        </w:rPr>
-        <w:t>int main()</w:t>
-      </w:r>
-    </w:p>
-    <w:p>
-      <w:pPr>
-        <w:rPr>
-          <w:sz w:val="28"/>
-          <w:szCs w:val="28"/>
-        </w:rPr>
-      </w:pPr>
-      <w:r>
-        <w:rPr>
-          <w:sz w:val="28"/>
-          <w:szCs w:val="28"/>
-        </w:rPr>
-        <w:t>{</w:t>
-      </w:r>
-    </w:p>
-    <w:p>
-      <w:pPr>
-        <w:rPr>
-          <w:sz w:val="28"/>
-          <w:szCs w:val="28"/>
-        </w:rPr>
-      </w:pPr>
-      <w:r>
-        <w:rPr>
-          <w:sz w:val="28"/>
-          <w:szCs w:val="28"/>
-        </w:rPr>
-        <w:t xml:space="preserve">    int </w:t>
-      </w:r>
-      <w:proofErr w:type="spellStart"/>
-      <w:r>
-        <w:rPr>
-          <w:sz w:val="28"/>
-          <w:szCs w:val="28"/>
-        </w:rPr>
-        <w:t>i</w:t>
-      </w:r>
-      <w:proofErr w:type="spellEnd"/>
-      <w:r>
-        <w:rPr>
-          <w:sz w:val="28"/>
-          <w:szCs w:val="28"/>
-        </w:rPr>
-        <w:t>, j, rows;</w:t>
-      </w:r>
-    </w:p>
-    <w:p>
-      <w:pPr>
-        <w:rPr>
-          <w:sz w:val="28"/>
-          <w:szCs w:val="28"/>
-        </w:rPr>
-      </w:pPr>
-    </w:p>
-    <w:p>
-      <w:pPr>
-        <w:rPr>
-          <w:sz w:val="28"/>
-          <w:szCs w:val="28"/>
-        </w:rPr>
-      </w:pPr>
-      <w:r>
-        <w:rPr>
-          <w:sz w:val="28"/>
-          <w:szCs w:val="28"/>
-        </w:rPr>
-        <w:t xml:space="preserve">    </w:t>
-      </w:r>
-      <w:proofErr w:type="spellStart"/>
-      <w:r>
-        <w:rPr>
-          <w:sz w:val="28"/>
-          <w:szCs w:val="28"/>
-        </w:rPr>
-        <w:t>scanf</w:t>
-      </w:r>
-      <w:proofErr w:type="spellEnd"/>
-      <w:r>
-        <w:rPr>
-          <w:sz w:val="28"/>
-          <w:szCs w:val="28"/>
-        </w:rPr>
-        <w:t>("%d", &amp;rows);</w:t>
-      </w:r>
-    </w:p>
-    <w:p>
-      <w:pPr>
-        <w:rPr>
-          <w:sz w:val="28"/>
-          <w:szCs w:val="28"/>
-        </w:rPr>
-      </w:pPr>
-    </w:p>
-    <w:p>
-      <w:pPr>
-        <w:rPr>
-          <w:sz w:val="28"/>
-          <w:szCs w:val="28"/>
-        </w:rPr>
-      </w:pPr>
-      <w:r>
-        <w:rPr>
-          <w:sz w:val="28"/>
-          <w:szCs w:val="28"/>
-        </w:rPr>
-        <w:t xml:space="preserve">    for(</w:t>
-      </w:r>
-      <w:proofErr w:type="spellStart"/>
-      <w:r>
-        <w:rPr>
-          <w:sz w:val="28"/>
-          <w:szCs w:val="28"/>
-        </w:rPr>
-        <w:t>i</w:t>
-      </w:r>
-      <w:proofErr w:type="spellEnd"/>
-      <w:r>
-        <w:rPr>
-          <w:sz w:val="28"/>
-          <w:szCs w:val="28"/>
-        </w:rPr>
-        <w:t xml:space="preserve"> = 1; </w:t>
-      </w:r>
-      <w:proofErr w:type="spellStart"/>
-      <w:r>
-        <w:rPr>
-          <w:sz w:val="28"/>
-          <w:szCs w:val="28"/>
-        </w:rPr>
-        <w:t>i</w:t>
-      </w:r>
-      <w:proofErr w:type="spellEnd"/>
-      <w:r>
-        <w:rPr>
-          <w:sz w:val="28"/>
-          <w:szCs w:val="28"/>
-        </w:rPr>
-        <w:t xml:space="preserve"> &lt;= rows; </w:t>
-      </w:r>
-      <w:proofErr w:type="spellStart"/>
-      <w:r>
-        <w:rPr>
-          <w:sz w:val="28"/>
-          <w:szCs w:val="28"/>
-        </w:rPr>
-        <w:t>i</w:t>
-      </w:r>
-      <w:proofErr w:type="spellEnd"/>
-      <w:r>
-        <w:rPr>
-          <w:sz w:val="28"/>
-          <w:szCs w:val="28"/>
-        </w:rPr>
-        <w:t>++)</w:t>
-      </w:r>
-    </w:p>
-    <w:p>
-      <w:pPr>
-        <w:rPr>
-          <w:sz w:val="28"/>
-          <w:szCs w:val="28"/>
-        </w:rPr>
-      </w:pPr>
-      <w:r>
-        <w:rPr>
-          <w:sz w:val="28"/>
-          <w:szCs w:val="28"/>
-        </w:rPr>
-        <w:t xml:space="preserve">    {</w:t>
-      </w:r>
-    </w:p>
-    <w:p>
-      <w:pPr>
-        <w:rPr>
-          <w:sz w:val="28"/>
-          <w:szCs w:val="28"/>
-        </w:rPr>
-      </w:pPr>
-      <w:r>
-        <w:rPr>
-          <w:sz w:val="28"/>
-          <w:szCs w:val="28"/>
-        </w:rPr>
-        <w:t xml:space="preserve">        for(j = 1; j &lt;= rows - </w:t>
-      </w:r>
-      <w:proofErr w:type="spellStart"/>
-      <w:r>
-        <w:rPr>
-          <w:sz w:val="28"/>
-          <w:szCs w:val="28"/>
-        </w:rPr>
-        <w:t>i</w:t>
-      </w:r>
-      <w:proofErr w:type="spellEnd"/>
-      <w:r>
-        <w:rPr>
-          <w:sz w:val="28"/>
-          <w:szCs w:val="28"/>
-        </w:rPr>
-        <w:t xml:space="preserve">; </w:t>
-      </w:r>
-      <w:proofErr w:type="spellStart"/>
-      <w:r>
-        <w:rPr>
-          <w:sz w:val="28"/>
-          <w:szCs w:val="28"/>
-        </w:rPr>
-        <w:t>j++</w:t>
-      </w:r>
-      <w:proofErr w:type="spellEnd"/>
-      <w:r>
-        <w:rPr>
-          <w:sz w:val="28"/>
-          <w:szCs w:val="28"/>
-        </w:rPr>
-        <w:t>)</w:t>
-      </w:r>
-    </w:p>
-    <w:p>
-      <w:pPr>
-        <w:rPr>
-          <w:sz w:val="28"/>
-          <w:szCs w:val="28"/>
-        </w:rPr>
-      </w:pPr>
-      <w:r>
-        <w:rPr>
-          <w:sz w:val="28"/>
-          <w:szCs w:val="28"/>
-        </w:rPr>
-        <w:t xml:space="preserve">        {</w:t>
-      </w:r>
-    </w:p>
-    <w:p>
-      <w:pPr>
-        <w:rPr>
-          <w:sz w:val="28"/>
-          <w:szCs w:val="28"/>
-        </w:rPr>
-      </w:pPr>
-      <w:r>
-        <w:rPr>
-          <w:sz w:val="28"/>
-          <w:szCs w:val="28"/>
-        </w:rPr>
-        <w:lastRenderedPageBreak/>
-        <w:t xml:space="preserve">            </w:t>
-      </w:r>
-      <w:proofErr w:type="spellStart"/>
-      <w:r>
-        <w:rPr>
-          <w:sz w:val="28"/>
-          <w:szCs w:val="28"/>
-        </w:rPr>
-        <w:t>printf</w:t>
-      </w:r>
-      <w:proofErr w:type="spellEnd"/>
-      <w:r>
-        <w:rPr>
-          <w:sz w:val="28"/>
-          <w:szCs w:val="28"/>
-        </w:rPr>
-        <w:t>(" ");</w:t>
-      </w:r>
-    </w:p>
-    <w:p>
-      <w:pPr>
-        <w:rPr>
-          <w:sz w:val="28"/>
-          <w:szCs w:val="28"/>
-        </w:rPr>
-      </w:pPr>
-      <w:r>
-        <w:rPr>
-          <w:sz w:val="28"/>
-          <w:szCs w:val="28"/>
-        </w:rPr>
-        <w:t xml:space="preserve">        }</w:t>
-      </w:r>
-    </w:p>
-    <w:p>
-      <w:pPr>
-        <w:rPr>
-          <w:sz w:val="28"/>
-          <w:szCs w:val="28"/>
-        </w:rPr>
-      </w:pPr>
-    </w:p>
-    <w:p>
-      <w:pPr>
-        <w:rPr>
-          <w:sz w:val="28"/>
-          <w:szCs w:val="28"/>
-        </w:rPr>
-      </w:pPr>
-      <w:r>
-        <w:rPr>
-          <w:sz w:val="28"/>
-          <w:szCs w:val="28"/>
-        </w:rPr>
-        <w:t xml:space="preserve">        for(j = 1; j &lt;= 2 * </w:t>
-      </w:r>
-      <w:proofErr w:type="spellStart"/>
-      <w:r>
-        <w:rPr>
-          <w:sz w:val="28"/>
-          <w:szCs w:val="28"/>
-        </w:rPr>
-        <w:t>i</w:t>
-      </w:r>
-      <w:proofErr w:type="spellEnd"/>
-      <w:r>
-        <w:rPr>
-          <w:sz w:val="28"/>
-          <w:szCs w:val="28"/>
-        </w:rPr>
-        <w:t xml:space="preserve"> - 1; </w:t>
-      </w:r>
-      <w:proofErr w:type="spellStart"/>
-      <w:r>
-        <w:rPr>
-          <w:sz w:val="28"/>
-          <w:szCs w:val="28"/>
-        </w:rPr>
-        <w:t>j++</w:t>
-      </w:r>
-      <w:proofErr w:type="spellEnd"/>
-      <w:r>
-        <w:rPr>
-          <w:sz w:val="28"/>
-          <w:szCs w:val="28"/>
-        </w:rPr>
-        <w:t>)</w:t>
-      </w:r>
-    </w:p>
-    <w:p>
-      <w:pPr>
-        <w:rPr>
-          <w:sz w:val="28"/>
-          <w:szCs w:val="28"/>
-        </w:rPr>
-      </w:pPr>
-      <w:r>
-        <w:rPr>
-          <w:sz w:val="28"/>
-          <w:szCs w:val="28"/>
-        </w:rPr>
-        <w:t xml:space="preserve">        {</w:t>
-      </w:r>
-    </w:p>
-    <w:p>
-      <w:pPr>
-        <w:rPr>
-          <w:sz w:val="28"/>
-          <w:szCs w:val="28"/>
-        </w:rPr>
-      </w:pPr>
-      <w:r>
-        <w:rPr>
-          <w:sz w:val="28"/>
-          <w:szCs w:val="28"/>
-        </w:rPr>
-        <w:t xml:space="preserve">            </w:t>
-      </w:r>
-      <w:proofErr w:type="spellStart"/>
-      <w:r>
-        <w:rPr>
-          <w:sz w:val="28"/>
-          <w:szCs w:val="28"/>
-        </w:rPr>
-        <w:t>printf</w:t>
-      </w:r>
-      <w:proofErr w:type="spellEnd"/>
-      <w:r>
-        <w:rPr>
-          <w:sz w:val="28"/>
-          <w:szCs w:val="28"/>
-        </w:rPr>
-        <w:t>("*");</w:t>
-      </w:r>
-    </w:p>
-    <w:p>
-      <w:pPr>
-        <w:rPr>
-          <w:sz w:val="28"/>
-          <w:szCs w:val="28"/>
-        </w:rPr>
-      </w:pPr>
-      <w:r>
-        <w:rPr>
-          <w:sz w:val="28"/>
-          <w:szCs w:val="28"/>
-        </w:rPr>
-        <w:t xml:space="preserve">        }</w:t>
-      </w:r>
-    </w:p>
-    <w:p>
-      <w:pPr>
-        <w:rPr>
-          <w:sz w:val="28"/>
-          <w:szCs w:val="28"/>
-        </w:rPr>
-      </w:pPr>
-    </w:p>
-    <w:p>
-      <w:pPr>
-        <w:rPr>
-          <w:sz w:val="28"/>
-          <w:szCs w:val="28"/>
-        </w:rPr>
-      </w:pPr>
-      <w:r>
-        <w:rPr>
-          <w:sz w:val="28"/>
-          <w:szCs w:val="28"/>
-        </w:rPr>
-        <w:t xml:space="preserve">        </w:t>
-      </w:r>
-      <w:proofErr w:type="spellStart"/>
-      <w:r>
-        <w:rPr>
-          <w:sz w:val="28"/>
-          <w:szCs w:val="28"/>
-        </w:rPr>
-        <w:t>printf</w:t>
-      </w:r>
-      <w:proofErr w:type="spellEnd"/>
-      <w:r>
-        <w:rPr>
-          <w:sz w:val="28"/>
-          <w:szCs w:val="28"/>
-        </w:rPr>
-        <w:t>("\n");</w:t>
+        <w:t xml:space="preserve">        printf("\n");</w:t>
       </w:r>
     </w:p>
     <w:p>
@@ -4152,6 +3170,7 @@
   <w:style w:type="character" w:default="1" w:styleId="DefaultParagraphFont">
     <w:name w:val="Default Paragraph Font"/>
     <w:uiPriority w:val="1"/>
+    <w:semiHidden/>
     <w:unhideWhenUsed/>
   </w:style>
   <w:style w:type="table" w:default="1" w:styleId="TableNormal">

</xml_diff>